<commit_message>
fix(report): update Section 6.6 graph schema terms and Section 7.5 Cypher queries to match production codebase
</commit_message>
<xml_diff>
--- a/VITCC_Library_Management_System_Final_Report.docx
+++ b/VITCC_Library_Management_System_Final_Report.docx
@@ -58,7 +58,7 @@
           <w:noProof/>
         </w:rPr>
         <w:drawing>
-          <wp:inline distT="0" distB="0" distL="0" distR="0" wp14:anchorId="6D5B53A6" wp14:editId="63A4FF1D">
+          <wp:inline distT="0" distB="0" distL="0" distR="0" wp14:anchorId="17C6054C" wp14:editId="22C5FA25">
             <wp:extent cx="1920240" cy="1093239"/>
             <wp:effectExtent l="0" t="0" r="0" b="0"/>
             <wp:docPr id="1" name="Picture 1"/>
@@ -5177,7 +5177,7 @@
           <w:color w:val="1F2937"/>
           <w:sz w:val="24"/>
         </w:rPr>
-        <w:t>In Phase 2, the production backend was completely migrated to Neo4j AuraDB, modeling academic entities as a Labeled Property Graph comprising 310 nodes across User, Book, Topic, Author, and Category labels interconnected via 685 typed relationships. Utilizing the Neo4j Cypher query language and graph data science algorithms, the system executes real-time k-hop collaborative recommendations, transitive prerequisite learning path traversals, cross-disciplinary shortest-path 'Book Bridge' discoveries, and netw</w:t>
+        <w:t>In Phase 2, the production backend was completely migrated to Neo4j AuraDB, modeling academic entities as a Labeled Property Graph comprising 310 nodes across User, Book, Copy, Loan, Author, and Category labels interconnected via 685 typed relationships. Utilizing the Neo4j Cypher query language and graph data science algorithms, the system executes real-time k-hop collaborative recommendations, transitive prerequisite learning path traversals, cross-disciplinary shortest-path 'Book Bridge' discoveries, and</w:t>
       </w:r>
       <w:r>
         <w:rPr>
@@ -5185,7 +5185,7 @@
           <w:color w:val="1F2937"/>
           <w:sz w:val="24"/>
         </w:rPr>
-        <w:t>ork centrality rankings (PageRank, Degree, and Betweenness Centrality) with constant-time O(1) index-free adjacency traversals.</w:t>
+        <w:t xml:space="preserve"> network centrality rankings (PageRank, Degree, and Betweenness Centrality) with constant-time O(1) index-free adjacency traversals.</w:t>
       </w:r>
     </w:p>
     <w:p>
@@ -6909,7 +6909,7 @@
           <w:color w:val="1F2937"/>
           <w:sz w:val="24"/>
         </w:rPr>
-        <w:t>Represent discrete operational entities such as Users, Books, Categories, Authors, and Curriculum Topics. Nodes can possess multiple descriptive labels and key-value properties.</w:t>
+        <w:t>Represent discrete operational entities such as Users, Books, Copies, Loans, Categories, and Authors. Nodes can possess multiple descriptive labels and key-value properties.</w:t>
       </w:r>
     </w:p>
     <w:p>
@@ -6933,7 +6933,7 @@
           <w:color w:val="1F2937"/>
           <w:sz w:val="24"/>
         </w:rPr>
-        <w:t>Represent directed, typed, and semantically rich connections between nodes (e.g., `BORROWED`, `COVERS_TOPIC`, `REQUIRES_PREREQUISITE`, `AUTHORED_BY`). Relationships are first-class database citizens stored with direct physical pointers.</w:t>
+        <w:t>Represent directed, typed, and semantically rich connections between nodes (e.g., `(u:User)-[:BORROWED]-&gt;(l:Loan)-[:FOR_COPY]-&gt;(cp:Copy)&lt;-[:HAS_COPY]-(b:Book)`, `(b:Book)-[:BELONGS_TO]-&gt;(c:Category)`, `(b1:Book)-[:PREREQUISITE_FOR]-&gt;(b2:Book)`, `(a:Author)-[:WROTE]-&gt;(b:Book)`). Relationships are first-class database citizens stored with direct physical pointers.</w:t>
       </w:r>
     </w:p>
     <w:p>
@@ -7074,6 +7074,7 @@
                 <w:color w:val="FFFFFF"/>
                 <w:sz w:val="21"/>
               </w:rPr>
+              <w:lastRenderedPageBreak/>
               <w:t>Architectural Aspect</w:t>
             </w:r>
           </w:p>
@@ -7126,17 +7127,7 @@
                 <w:color w:val="FFFFFF"/>
                 <w:sz w:val="21"/>
               </w:rPr>
-              <w:t xml:space="preserve">Modern Graph DBMS (Neo4j </w:t>
-            </w:r>
-            <w:r>
-              <w:rPr>
-                <w:rFonts w:ascii="Times New Roman" w:hAnsi="Times New Roman"/>
-                <w:b/>
-                <w:color w:val="FFFFFF"/>
-                <w:sz w:val="21"/>
-              </w:rPr>
-              <w:lastRenderedPageBreak/>
-              <w:t>AuraDB)</w:t>
+              <w:t>Modern Graph DBMS (Neo4j AuraDB)</w:t>
             </w:r>
           </w:p>
         </w:tc>
@@ -7167,7 +7158,6 @@
                 <w:color w:val="1F2937"/>
                 <w:sz w:val="20"/>
               </w:rPr>
-              <w:lastRenderedPageBreak/>
               <w:t>Fundamental Data Model</w:t>
             </w:r>
           </w:p>
@@ -8010,7 +8000,7 @@
           <w:noProof/>
         </w:rPr>
         <w:drawing>
-          <wp:inline distT="0" distB="0" distL="0" distR="0" wp14:anchorId="4BDBE675" wp14:editId="4E24F80F">
+          <wp:inline distT="0" distB="0" distL="0" distR="0" wp14:anchorId="201A2680" wp14:editId="2643B3CD">
             <wp:extent cx="5486400" cy="3086100"/>
             <wp:effectExtent l="0" t="0" r="0" b="0"/>
             <wp:docPr id="2" name="Picture 2"/>
@@ -10089,7 +10079,7 @@
           <w:color w:val="1F2937"/>
           <w:sz w:val="24"/>
         </w:rPr>
-        <w:t>`:User` (properties: user_id, full_name, email, role, account_status), `:Book` (book_id, isbn, title, edition, pub_year, available_copies), `:Category` (category_id, name), `:Author` (author_id, name), `:Topic` (topic_id, name, level).</w:t>
+        <w:t>`:User` (properties: user_id, username, email, role, account_status), `:Book` (book_id, isbn, title, edition, pub_year, available_copies), `:Copy` (copy_id, barcode, status), `:Loan` (loan_id, due_date, status), `:Category` (category_id, name), `:Author` (author_id, name).</w:t>
       </w:r>
     </w:p>
     <w:p>
@@ -10113,7 +10103,7 @@
           <w:color w:val="1F2937"/>
           <w:sz w:val="24"/>
         </w:rPr>
-        <w:t>`(u:User)-[:BORROWED {loan_id, status, due_date}]-&gt;(b:Book)`; `(b:Book)-[:BELONGS_TO]-&gt;(c:Category)`; `(b:Book)-[:COVERS_TOPIC]-&gt;(t:Topic)`; `(t1:Topic)-[:REQUIRES_PREREQUISITE]-&gt;(t2:Topic)`; `(b:Book)-[:AUTHORED_BY]-&gt;(a:Author)`.</w:t>
+        <w:t>`(u:User)-[:BORROWED]-&gt;(l:Loan)-[:FOR_COPY]-&gt;(cp:Copy)&lt;-[:HAS_COPY]-(b:Book)`; `(b:Book)-[:BELONGS_TO]-&gt;(c:Category)`; `(b1:Book)-[:PREREQUISITE_FOR]-&gt;(b2:Book)`; `(a:Author)-[:WROTE]-&gt;(b:Book)`.</w:t>
       </w:r>
     </w:p>
     <w:p>
@@ -11615,7 +11605,7 @@
                 <w:color w:val="1F2937"/>
                 <w:sz w:val="18"/>
               </w:rPr>
-              <w:t>// Collaborative Filtering: Books borrowed by peers with similar reading histories</w:t>
+              <w:t>// Collaborative Filtering: Peer borrowing clusters matching exact codebase schema</w:t>
             </w:r>
             <w:r>
               <w:rPr>
@@ -11624,7 +11614,7 @@
                 <w:sz w:val="18"/>
               </w:rPr>
               <w:br/>
-              <w:t>MATCH (u:User {user_id: $user_id})-[:BORROWED]-&gt;(b1:Book)&lt;-[:BORROWED]-(peer:User)-[:BORROWED]-&gt;(b2:Book)</w:t>
+              <w:t>MATCH (me:User {user_id: $uid})-[:BORROWED]-&gt;(:Loan)-[:FOR_COPY]-&gt;(:Copy)&lt;-[:HAS_COPY]-(b1:Book)-[:BELONGS_TO]-&gt;(cat:Category)</w:t>
             </w:r>
             <w:r>
               <w:rPr>
@@ -11633,7 +11623,7 @@
                 <w:sz w:val="18"/>
               </w:rPr>
               <w:br/>
-              <w:t>WHERE NOT (u)-[:BORROWED]-&gt;(b2)</w:t>
+              <w:t>MATCH (other:User {role: 'Student'})-[:BORROWED]-&gt;(:Loan)-[:FOR_COPY]-&gt;(:Copy)&lt;-[:HAS_COPY]-(b2:Book)-[:BELONGS_TO]-&gt;(cat)</w:t>
             </w:r>
             <w:r>
               <w:rPr>
@@ -11642,7 +11632,7 @@
                 <w:sz w:val="18"/>
               </w:rPr>
               <w:br/>
-              <w:t>RETURN b2.title AS RecommendedBook, count(peer) AS RecommendationStrength, collect(DISTINCT peer.full_name)[..3] AS PeerReaders</w:t>
+              <w:t>WHERE other.user_id &lt;&gt; $uid AND NOT (me)-[:BORROWED]-&gt;(:Loan)-[:FOR_COPY]-&gt;(:Copy)&lt;-[:HAS_COPY]-(b2)</w:t>
             </w:r>
             <w:r>
               <w:rPr>
@@ -11651,7 +11641,14 @@
                 <w:sz w:val="18"/>
               </w:rPr>
               <w:br/>
-              <w:t>ORDER BY RecommendationStrength DESC</w:t>
+            </w:r>
+            <w:r>
+              <w:rPr>
+                <w:rFonts w:ascii="Courier New" w:hAnsi="Courier New"/>
+                <w:color w:val="1F2937"/>
+                <w:sz w:val="18"/>
+              </w:rPr>
+              <w:t>RETURN b2.title AS RecommendedBook, count(DISTINCT other) AS RecommendationStrength</w:t>
             </w:r>
             <w:r>
               <w:rPr>
@@ -11660,7 +11657,7 @@
                 <w:sz w:val="18"/>
               </w:rPr>
               <w:br/>
-              <w:t>LIMIT 5;</w:t>
+              <w:t>ORDER BY RecommendationStrength DESC LIMIT 5;</w:t>
             </w:r>
           </w:p>
         </w:tc>
@@ -11733,7 +11730,7 @@
                 <w:color w:val="1F2937"/>
                 <w:sz w:val="18"/>
               </w:rPr>
-              <w:t>// Multi-tier prerequisite path for academic topics</w:t>
+              <w:t>// Multi-tier prerequisite paths mapping foundational to advanced textbooks</w:t>
             </w:r>
             <w:r>
               <w:rPr>
@@ -11742,7 +11739,7 @@
                 <w:sz w:val="18"/>
               </w:rPr>
               <w:br/>
-              <w:t>MATCH path = (target:Topic {name: $topic_name})&lt;-[:REQUIRES_PREREQUISITE*1..4]-(prereq:Topic)</w:t>
+              <w:t>MATCH path = (root:Book)-[:PREREQUISITE_FOR*1..4]-&gt;(target:Book)</w:t>
             </w:r>
             <w:r>
               <w:rPr>
@@ -11751,7 +11748,7 @@
                 <w:sz w:val="18"/>
               </w:rPr>
               <w:br/>
-              <w:t>UNWIND nodes(path) AS stepNode</w:t>
+              <w:t>WHERE NOT ()-[:PREREQUISITE_FOR]-&gt;(root) AND NOT (target)-[:PREREQUISITE_FOR]-&gt;()</w:t>
             </w:r>
             <w:r>
               <w:rPr>
@@ -11760,25 +11757,14 @@
                 <w:sz w:val="18"/>
               </w:rPr>
               <w:br/>
-              <w:t>MATCH (b:Book)-[:COVERS_TOPIC]-&gt;(stepNode)</w:t>
-            </w:r>
-            <w:r>
-              <w:rPr>
-                <w:rFonts w:ascii="Courier New" w:hAnsi="Courier New"/>
-                <w:color w:val="1F2937"/>
-                <w:sz w:val="18"/>
-              </w:rPr>
-              <w:br/>
-              <w:t>RETURN stepNode.name AS ConceptStep, length(path) AS HierarchyLevel, collect(DISTINCT b.title) AS RecommendedTextbooks</w:t>
-            </w:r>
-            <w:r>
-              <w:rPr>
-                <w:rFonts w:ascii="Courier New" w:hAnsi="Courier New"/>
-                <w:color w:val="1F2937"/>
-                <w:sz w:val="18"/>
-              </w:rPr>
-              <w:br/>
-              <w:t>ORDER BY HierarchyLevel DESC;</w:t>
+            </w:r>
+            <w:r>
+              <w:rPr>
+                <w:rFonts w:ascii="Courier New" w:hAnsi="Courier New"/>
+                <w:color w:val="1F2937"/>
+                <w:sz w:val="18"/>
+              </w:rPr>
+              <w:t>RETURN [n IN nodes(path) | {id: n.book_id, title: n.title}] AS nodes_in_path, length(path) AS depth;</w:t>
             </w:r>
           </w:p>
         </w:tc>
@@ -11851,7 +11837,7 @@
                 <w:color w:val="1F2937"/>
                 <w:sz w:val="18"/>
               </w:rPr>
-              <w:t>// Dijkstra / BFS shortest path connecting two disparate academic disciplines</w:t>
+              <w:t>// Dijkstra shortest path connecting two disparate academic disciplines</w:t>
             </w:r>
             <w:r>
               <w:rPr>
@@ -11860,7 +11846,7 @@
                 <w:sz w:val="18"/>
               </w:rPr>
               <w:br/>
-              <w:t>MATCH (b1:Book {title: $book1_title}), (b2:Book {title: $book2_title})</w:t>
+              <w:t>MATCH p = shortestPath((b1:Book {book_id: $id1})-[:BELONGS_TO|WROTE|PUBLISHED_BY|PREREQUISITE_FOR*1..5]-(b2:Book {book_id: $id2}))</w:t>
             </w:r>
             <w:r>
               <w:rPr>
@@ -11869,16 +11855,7 @@
                 <w:sz w:val="18"/>
               </w:rPr>
               <w:br/>
-              <w:t>MATCH path = shortestPath((b1)-[*]-(b2))</w:t>
-            </w:r>
-            <w:r>
-              <w:rPr>
-                <w:rFonts w:ascii="Courier New" w:hAnsi="Courier New"/>
-                <w:color w:val="1F2937"/>
-                <w:sz w:val="18"/>
-              </w:rPr>
-              <w:br/>
-              <w:t>RETURN [n IN nodes(path) | coalesce(n.title, n.name)] AS ConnectionBridge, length(path) AS BridgeDegree;</w:t>
+              <w:t>RETURN p;</w:t>
             </w:r>
           </w:p>
         </w:tc>
@@ -11951,7 +11928,7 @@
                 <w:color w:val="1F2937"/>
                 <w:sz w:val="18"/>
               </w:rPr>
-              <w:t>// Centrality: Discovering influential textbooks bridging academic domains</w:t>
+              <w:t>// Degree Centrality: Discovering influential textbooks by node connections and circulation volume</w:t>
             </w:r>
             <w:r>
               <w:rPr>
@@ -11969,14 +11946,7 @@
                 <w:sz w:val="18"/>
               </w:rPr>
               <w:br/>
-            </w:r>
-            <w:r>
-              <w:rPr>
-                <w:rFonts w:ascii="Courier New" w:hAnsi="Courier New"/>
-                <w:color w:val="1F2937"/>
-                <w:sz w:val="18"/>
-              </w:rPr>
-              <w:t>RETURN b.title AS Title, size((b)--()) AS DegreeCentrality, size((b)&lt;-[:BORROWED]-()) AS CirculationVolume</w:t>
+              <w:t>OPTIONAL MATCH (b)-[:HAS_COPY]-&gt;(cp:Copy)</w:t>
             </w:r>
             <w:r>
               <w:rPr>
@@ -11985,7 +11955,7 @@
                 <w:sz w:val="18"/>
               </w:rPr>
               <w:br/>
-              <w:t>ORDER BY DegreeCentrality DESC</w:t>
+              <w:t>OPTIONAL MATCH (cp)&lt;-[:FOR_COPY]-(l:Loan)</w:t>
             </w:r>
             <w:r>
               <w:rPr>
@@ -11994,7 +11964,16 @@
                 <w:sz w:val="18"/>
               </w:rPr>
               <w:br/>
-              <w:t>LIMIT 10;</w:t>
+              <w:t>RETURN b.title AS Title, size((b)--()) AS DegreeCentrality, count(DISTINCT l) AS CirculationVolume</w:t>
+            </w:r>
+            <w:r>
+              <w:rPr>
+                <w:rFonts w:ascii="Courier New" w:hAnsi="Courier New"/>
+                <w:color w:val="1F2937"/>
+                <w:sz w:val="18"/>
+              </w:rPr>
+              <w:br/>
+              <w:t>ORDER BY DegreeCentrality DESC LIMIT 10;</w:t>
             </w:r>
           </w:p>
         </w:tc>
@@ -14959,7 +14938,7 @@
           <w:noProof/>
         </w:rPr>
         <w:drawing>
-          <wp:inline distT="0" distB="0" distL="0" distR="0" wp14:anchorId="7B4D4451" wp14:editId="5E42D4B4">
+          <wp:inline distT="0" distB="0" distL="0" distR="0" wp14:anchorId="0E5574E6" wp14:editId="7F726295">
             <wp:extent cx="5120640" cy="3111275"/>
             <wp:effectExtent l="0" t="0" r="0" b="0"/>
             <wp:docPr id="3" name="Picture 3"/>
@@ -15035,7 +15014,7 @@
         </w:rPr>
         <w:lastRenderedPageBreak/>
         <w:drawing>
-          <wp:inline distT="0" distB="0" distL="0" distR="0" wp14:anchorId="44E6F234" wp14:editId="6AE6958C">
+          <wp:inline distT="0" distB="0" distL="0" distR="0" wp14:anchorId="623CF5D3" wp14:editId="57AF77B1">
             <wp:extent cx="5120640" cy="3111275"/>
             <wp:effectExtent l="0" t="0" r="0" b="0"/>
             <wp:docPr id="4" name="Picture 4"/>
@@ -15110,7 +15089,7 @@
           <w:noProof/>
         </w:rPr>
         <w:drawing>
-          <wp:inline distT="0" distB="0" distL="0" distR="0" wp14:anchorId="2B0401D7" wp14:editId="53C750D3">
+          <wp:inline distT="0" distB="0" distL="0" distR="0" wp14:anchorId="018FAB8E" wp14:editId="7FB5096D">
             <wp:extent cx="5120640" cy="3111275"/>
             <wp:effectExtent l="0" t="0" r="0" b="0"/>
             <wp:docPr id="5" name="Picture 5"/>
@@ -15186,7 +15165,7 @@
         </w:rPr>
         <w:lastRenderedPageBreak/>
         <w:drawing>
-          <wp:inline distT="0" distB="0" distL="0" distR="0" wp14:anchorId="20747F94" wp14:editId="304F0AD6">
+          <wp:inline distT="0" distB="0" distL="0" distR="0" wp14:anchorId="5F378632" wp14:editId="70240B3F">
             <wp:extent cx="5120640" cy="3111275"/>
             <wp:effectExtent l="0" t="0" r="0" b="0"/>
             <wp:docPr id="6" name="Picture 6"/>
@@ -15261,7 +15240,7 @@
           <w:noProof/>
         </w:rPr>
         <w:drawing>
-          <wp:inline distT="0" distB="0" distL="0" distR="0" wp14:anchorId="635F84D0" wp14:editId="62770DEE">
+          <wp:inline distT="0" distB="0" distL="0" distR="0" wp14:anchorId="31D05CFC" wp14:editId="218BF502">
             <wp:extent cx="5120640" cy="3111275"/>
             <wp:effectExtent l="0" t="0" r="0" b="0"/>
             <wp:docPr id="7" name="Picture 7"/>
@@ -15337,7 +15316,7 @@
         </w:rPr>
         <w:lastRenderedPageBreak/>
         <w:drawing>
-          <wp:inline distT="0" distB="0" distL="0" distR="0" wp14:anchorId="0C5E52A8" wp14:editId="1995BFCA">
+          <wp:inline distT="0" distB="0" distL="0" distR="0" wp14:anchorId="11430FD1" wp14:editId="54C28058">
             <wp:extent cx="5120640" cy="3111275"/>
             <wp:effectExtent l="0" t="0" r="0" b="0"/>
             <wp:docPr id="8" name="Picture 8"/>
@@ -15412,7 +15391,7 @@
           <w:noProof/>
         </w:rPr>
         <w:drawing>
-          <wp:inline distT="0" distB="0" distL="0" distR="0" wp14:anchorId="20EB6A2C" wp14:editId="0254DFE6">
+          <wp:inline distT="0" distB="0" distL="0" distR="0" wp14:anchorId="44C28B62" wp14:editId="7669F927">
             <wp:extent cx="5120640" cy="3111275"/>
             <wp:effectExtent l="0" t="0" r="0" b="0"/>
             <wp:docPr id="9" name="Picture 9"/>
@@ -15488,7 +15467,7 @@
         </w:rPr>
         <w:lastRenderedPageBreak/>
         <w:drawing>
-          <wp:inline distT="0" distB="0" distL="0" distR="0" wp14:anchorId="0D1E19BA" wp14:editId="56CDBDA0">
+          <wp:inline distT="0" distB="0" distL="0" distR="0" wp14:anchorId="5A88431B" wp14:editId="3883390D">
             <wp:extent cx="5120640" cy="3111275"/>
             <wp:effectExtent l="0" t="0" r="0" b="0"/>
             <wp:docPr id="10" name="Picture 10"/>
@@ -15563,7 +15542,7 @@
           <w:noProof/>
         </w:rPr>
         <w:drawing>
-          <wp:inline distT="0" distB="0" distL="0" distR="0" wp14:anchorId="2DF097C8" wp14:editId="01FB9719">
+          <wp:inline distT="0" distB="0" distL="0" distR="0" wp14:anchorId="1D308430" wp14:editId="694BDE75">
             <wp:extent cx="5120640" cy="3111275"/>
             <wp:effectExtent l="0" t="0" r="0" b="0"/>
             <wp:docPr id="11" name="Picture 11"/>
@@ -15639,7 +15618,7 @@
         </w:rPr>
         <w:lastRenderedPageBreak/>
         <w:drawing>
-          <wp:inline distT="0" distB="0" distL="0" distR="0" wp14:anchorId="2BE0397B" wp14:editId="5409DB48">
+          <wp:inline distT="0" distB="0" distL="0" distR="0" wp14:anchorId="1EA2111D" wp14:editId="4A773A82">
             <wp:extent cx="5120640" cy="3111275"/>
             <wp:effectExtent l="0" t="0" r="0" b="0"/>
             <wp:docPr id="12" name="Picture 12"/>
@@ -15714,7 +15693,7 @@
           <w:noProof/>
         </w:rPr>
         <w:drawing>
-          <wp:inline distT="0" distB="0" distL="0" distR="0" wp14:anchorId="192E4176" wp14:editId="1E91F95A">
+          <wp:inline distT="0" distB="0" distL="0" distR="0" wp14:anchorId="5B0C772D" wp14:editId="0844CD0C">
             <wp:extent cx="5120640" cy="3111275"/>
             <wp:effectExtent l="0" t="0" r="0" b="0"/>
             <wp:docPr id="13" name="Picture 13"/>
@@ -15790,7 +15769,7 @@
         </w:rPr>
         <w:lastRenderedPageBreak/>
         <w:drawing>
-          <wp:inline distT="0" distB="0" distL="0" distR="0" wp14:anchorId="6117AEFC" wp14:editId="64A0E9B6">
+          <wp:inline distT="0" distB="0" distL="0" distR="0" wp14:anchorId="527AF4B7" wp14:editId="520AE287">
             <wp:extent cx="5120640" cy="3111275"/>
             <wp:effectExtent l="0" t="0" r="0" b="0"/>
             <wp:docPr id="14" name="Picture 14"/>
@@ -16135,7 +16114,7 @@
                 <w:sz w:val="18"/>
               </w:rPr>
               <w:lastRenderedPageBreak/>
-              <w:t>MATCH (targetUser:User {user_id: 101})-[:BORROWED]-&gt;(seedBook:Book)</w:t>
+              <w:t>// Demonstration of Multi-Hop Collaborative Peer Traversal</w:t>
             </w:r>
             <w:r>
               <w:rPr>
@@ -16144,7 +16123,7 @@
                 <w:sz w:val="18"/>
               </w:rPr>
               <w:br/>
-              <w:t>MATCH (seedBook)&lt;-[:BORROWED]-(peer:User)-[:BORROWED]-&gt;(recBook:Book)</w:t>
+              <w:t>MATCH (me:User {user_id: 101})-[:BORROWED]-&gt;(:Loan)-[:FOR_COPY]-&gt;(:Copy)&lt;-[:HAS_COPY]-(b1:Book)-[:BELONGS_TO]-&gt;(cat:Category)</w:t>
             </w:r>
             <w:r>
               <w:rPr>
@@ -16153,7 +16132,14 @@
                 <w:sz w:val="18"/>
               </w:rPr>
               <w:br/>
-              <w:t>WHERE NOT (targetUser)-[:BORROWED]-&gt;(recBook)</w:t>
+            </w:r>
+            <w:r>
+              <w:rPr>
+                <w:rFonts w:ascii="Courier New" w:hAnsi="Courier New"/>
+                <w:color w:val="1F2937"/>
+                <w:sz w:val="18"/>
+              </w:rPr>
+              <w:t>MATCH (other:User {role: 'Student'})-[:BORROWED]-&gt;(:Loan)-[:FOR_COPY]-&gt;(:Copy)&lt;-[:HAS_COPY]-(b2:Book)-[:BELONGS_TO]-&gt;(cat)</w:t>
             </w:r>
             <w:r>
               <w:rPr>
@@ -16162,7 +16148,7 @@
                 <w:sz w:val="18"/>
               </w:rPr>
               <w:br/>
-              <w:t>WITH recBook, count(DISTINCT peer) AS peer_count</w:t>
+              <w:t>WHERE other.user_id &lt;&gt; 101 AND NOT (me)-[:BORROWED]-&gt;(:Loan)-[:FOR_COPY]-&gt;(:Copy)&lt;-[:HAS_COPY]-(b2)</w:t>
             </w:r>
             <w:r>
               <w:rPr>
@@ -16171,14 +16157,7 @@
                 <w:sz w:val="18"/>
               </w:rPr>
               <w:br/>
-            </w:r>
-            <w:r>
-              <w:rPr>
-                <w:rFonts w:ascii="Courier New" w:hAnsi="Courier New"/>
-                <w:color w:val="1F2937"/>
-                <w:sz w:val="18"/>
-              </w:rPr>
-              <w:t>MATCH (recBook)-[:BELONGS_TO]-&gt;(cat:Category)</w:t>
+              <w:t>RETURN b2.title AS RecommendedBook, cat.name AS Category, count(DISTINCT other) AS RecommendationStrength</w:t>
             </w:r>
             <w:r>
               <w:rPr>
@@ -16187,16 +16166,7 @@
                 <w:sz w:val="18"/>
               </w:rPr>
               <w:br/>
-              <w:t>RETURN recBook.title AS Title, cat.name AS Category, peer_count AS PopularityScore</w:t>
-            </w:r>
-            <w:r>
-              <w:rPr>
-                <w:rFonts w:ascii="Courier New" w:hAnsi="Courier New"/>
-                <w:color w:val="1F2937"/>
-                <w:sz w:val="18"/>
-              </w:rPr>
-              <w:br/>
-              <w:t>ORDER BY PopularityScore DESC</w:t>
+              <w:t>ORDER BY RecommendationStrength DESC</w:t>
             </w:r>
             <w:r>
               <w:rPr>
@@ -19835,31 +19805,31 @@
       </w:rPr>
     </w:lvl>
   </w:abstractNum>
-  <w:num w:numId="1" w16cid:durableId="163013236">
+  <w:num w:numId="1" w16cid:durableId="1475637888">
     <w:abstractNumId w:val="8"/>
   </w:num>
-  <w:num w:numId="2" w16cid:durableId="157354928">
+  <w:num w:numId="2" w16cid:durableId="1631939893">
     <w:abstractNumId w:val="6"/>
   </w:num>
-  <w:num w:numId="3" w16cid:durableId="1262955656">
+  <w:num w:numId="3" w16cid:durableId="1771660793">
     <w:abstractNumId w:val="5"/>
   </w:num>
-  <w:num w:numId="4" w16cid:durableId="551845564">
+  <w:num w:numId="4" w16cid:durableId="2112815500">
     <w:abstractNumId w:val="4"/>
   </w:num>
-  <w:num w:numId="5" w16cid:durableId="113670851">
+  <w:num w:numId="5" w16cid:durableId="2062359723">
     <w:abstractNumId w:val="7"/>
   </w:num>
-  <w:num w:numId="6" w16cid:durableId="1276406245">
+  <w:num w:numId="6" w16cid:durableId="1706370189">
     <w:abstractNumId w:val="3"/>
   </w:num>
-  <w:num w:numId="7" w16cid:durableId="704718721">
+  <w:num w:numId="7" w16cid:durableId="2108572530">
     <w:abstractNumId w:val="2"/>
   </w:num>
-  <w:num w:numId="8" w16cid:durableId="134683551">
+  <w:num w:numId="8" w16cid:durableId="343092158">
     <w:abstractNumId w:val="1"/>
   </w:num>
-  <w:num w:numId="9" w16cid:durableId="245695909">
+  <w:num w:numId="9" w16cid:durableId="240263343">
     <w:abstractNumId w:val="0"/>
   </w:num>
 </w:numbering>

</xml_diff>

<commit_message>
fix(report): streamline title page by removing subtitle and renaming title to Online Library Management System
</commit_message>
<xml_diff>
--- a/VITCC_Library_Management_System_Final_Report.docx
+++ b/VITCC_Library_Management_System_Final_Report.docx
@@ -58,7 +58,7 @@
           <w:noProof/>
         </w:rPr>
         <w:drawing>
-          <wp:inline distT="0" distB="0" distL="0" distR="0" wp14:anchorId="17C6054C" wp14:editId="22C5FA25">
+          <wp:inline distT="0" distB="0" distL="0" distR="0" wp14:anchorId="0394DDDE" wp14:editId="01103969">
             <wp:extent cx="1920240" cy="1093239"/>
             <wp:effectExtent l="0" t="0" r="0" b="0"/>
             <wp:docPr id="1" name="Picture 1"/>
@@ -96,7 +96,7 @@
     </w:p>
     <w:p>
       <w:pPr>
-        <w:spacing w:before="240" w:after="160"/>
+        <w:spacing w:before="280" w:after="160"/>
         <w:jc w:val="center"/>
       </w:pPr>
       <w:r>
@@ -125,44 +125,27 @@
           <w:sz w:val="32"/>
         </w:rPr>
         <w:br/>
-        <w:t>Title: Enterprise Library Management System</w:t>
-      </w:r>
+        <w:t>Title: Online Library Management System</w:t>
+      </w:r>
+    </w:p>
+    <w:p>
+      <w:pPr>
+        <w:spacing w:before="80" w:after="320"/>
+        <w:jc w:val="center"/>
+      </w:pPr>
       <w:r>
         <w:rPr>
           <w:rFonts w:ascii="Times New Roman" w:hAnsi="Times New Roman"/>
           <w:b/>
-          <w:color w:val="1B365D"/>
-          <w:sz w:val="32"/>
-        </w:rPr>
-        <w:br/>
-        <w:t>Sub-title: Modern Academic Library Management System with Phased Migration from Oracle 21c Relational Database to Neo4j AuraDB Graph Database</w:t>
-      </w:r>
-    </w:p>
-    <w:p>
-      <w:pPr>
-        <w:spacing w:before="160" w:after="280"/>
-        <w:jc w:val="center"/>
-      </w:pPr>
-      <w:r>
-        <w:rPr>
-          <w:rFonts w:ascii="Times New Roman" w:hAnsi="Times New Roman"/>
           <w:color w:val="1F2937"/>
           <w:sz w:val="24"/>
         </w:rPr>
-        <w:t>A Project Report Submitted in Partial Fulfillment of the Requirements for</w:t>
-      </w:r>
-      <w:r>
-        <w:rPr>
-          <w:rFonts w:ascii="Times New Roman" w:hAnsi="Times New Roman"/>
-          <w:color w:val="1F2937"/>
-          <w:sz w:val="24"/>
-        </w:rPr>
-        <w:br/>
         <w:t>BACSE202 — Database Systems</w:t>
       </w:r>
       <w:r>
         <w:rPr>
           <w:rFonts w:ascii="Times New Roman" w:hAnsi="Times New Roman"/>
+          <w:b/>
           <w:color w:val="1F2937"/>
           <w:sz w:val="24"/>
         </w:rPr>
@@ -8000,7 +7983,7 @@
           <w:noProof/>
         </w:rPr>
         <w:drawing>
-          <wp:inline distT="0" distB="0" distL="0" distR="0" wp14:anchorId="201A2680" wp14:editId="2643B3CD">
+          <wp:inline distT="0" distB="0" distL="0" distR="0" wp14:anchorId="6677279E" wp14:editId="0437B444">
             <wp:extent cx="5486400" cy="3086100"/>
             <wp:effectExtent l="0" t="0" r="0" b="0"/>
             <wp:docPr id="2" name="Picture 2"/>
@@ -14938,7 +14921,7 @@
           <w:noProof/>
         </w:rPr>
         <w:drawing>
-          <wp:inline distT="0" distB="0" distL="0" distR="0" wp14:anchorId="0E5574E6" wp14:editId="7F726295">
+          <wp:inline distT="0" distB="0" distL="0" distR="0" wp14:anchorId="680B47CD" wp14:editId="13CE7F08">
             <wp:extent cx="5120640" cy="3111275"/>
             <wp:effectExtent l="0" t="0" r="0" b="0"/>
             <wp:docPr id="3" name="Picture 3"/>
@@ -15014,7 +14997,7 @@
         </w:rPr>
         <w:lastRenderedPageBreak/>
         <w:drawing>
-          <wp:inline distT="0" distB="0" distL="0" distR="0" wp14:anchorId="623CF5D3" wp14:editId="57AF77B1">
+          <wp:inline distT="0" distB="0" distL="0" distR="0" wp14:anchorId="73EC1D89" wp14:editId="4436037C">
             <wp:extent cx="5120640" cy="3111275"/>
             <wp:effectExtent l="0" t="0" r="0" b="0"/>
             <wp:docPr id="4" name="Picture 4"/>
@@ -15089,7 +15072,7 @@
           <w:noProof/>
         </w:rPr>
         <w:drawing>
-          <wp:inline distT="0" distB="0" distL="0" distR="0" wp14:anchorId="018FAB8E" wp14:editId="7FB5096D">
+          <wp:inline distT="0" distB="0" distL="0" distR="0" wp14:anchorId="6730897B" wp14:editId="4C1720EE">
             <wp:extent cx="5120640" cy="3111275"/>
             <wp:effectExtent l="0" t="0" r="0" b="0"/>
             <wp:docPr id="5" name="Picture 5"/>
@@ -15165,7 +15148,7 @@
         </w:rPr>
         <w:lastRenderedPageBreak/>
         <w:drawing>
-          <wp:inline distT="0" distB="0" distL="0" distR="0" wp14:anchorId="5F378632" wp14:editId="70240B3F">
+          <wp:inline distT="0" distB="0" distL="0" distR="0" wp14:anchorId="2E571DDC" wp14:editId="5F213AC4">
             <wp:extent cx="5120640" cy="3111275"/>
             <wp:effectExtent l="0" t="0" r="0" b="0"/>
             <wp:docPr id="6" name="Picture 6"/>
@@ -15240,7 +15223,7 @@
           <w:noProof/>
         </w:rPr>
         <w:drawing>
-          <wp:inline distT="0" distB="0" distL="0" distR="0" wp14:anchorId="31D05CFC" wp14:editId="218BF502">
+          <wp:inline distT="0" distB="0" distL="0" distR="0" wp14:anchorId="18D853BD" wp14:editId="3E1127AB">
             <wp:extent cx="5120640" cy="3111275"/>
             <wp:effectExtent l="0" t="0" r="0" b="0"/>
             <wp:docPr id="7" name="Picture 7"/>
@@ -15316,7 +15299,7 @@
         </w:rPr>
         <w:lastRenderedPageBreak/>
         <w:drawing>
-          <wp:inline distT="0" distB="0" distL="0" distR="0" wp14:anchorId="11430FD1" wp14:editId="54C28058">
+          <wp:inline distT="0" distB="0" distL="0" distR="0" wp14:anchorId="332B92D4" wp14:editId="29ACA256">
             <wp:extent cx="5120640" cy="3111275"/>
             <wp:effectExtent l="0" t="0" r="0" b="0"/>
             <wp:docPr id="8" name="Picture 8"/>
@@ -15391,7 +15374,7 @@
           <w:noProof/>
         </w:rPr>
         <w:drawing>
-          <wp:inline distT="0" distB="0" distL="0" distR="0" wp14:anchorId="44C28B62" wp14:editId="7669F927">
+          <wp:inline distT="0" distB="0" distL="0" distR="0" wp14:anchorId="5EDC967B" wp14:editId="4F85D356">
             <wp:extent cx="5120640" cy="3111275"/>
             <wp:effectExtent l="0" t="0" r="0" b="0"/>
             <wp:docPr id="9" name="Picture 9"/>
@@ -15467,7 +15450,7 @@
         </w:rPr>
         <w:lastRenderedPageBreak/>
         <w:drawing>
-          <wp:inline distT="0" distB="0" distL="0" distR="0" wp14:anchorId="5A88431B" wp14:editId="3883390D">
+          <wp:inline distT="0" distB="0" distL="0" distR="0" wp14:anchorId="5C095E3C" wp14:editId="6E711563">
             <wp:extent cx="5120640" cy="3111275"/>
             <wp:effectExtent l="0" t="0" r="0" b="0"/>
             <wp:docPr id="10" name="Picture 10"/>
@@ -15542,7 +15525,7 @@
           <w:noProof/>
         </w:rPr>
         <w:drawing>
-          <wp:inline distT="0" distB="0" distL="0" distR="0" wp14:anchorId="1D308430" wp14:editId="694BDE75">
+          <wp:inline distT="0" distB="0" distL="0" distR="0" wp14:anchorId="034E5EE5" wp14:editId="709B2844">
             <wp:extent cx="5120640" cy="3111275"/>
             <wp:effectExtent l="0" t="0" r="0" b="0"/>
             <wp:docPr id="11" name="Picture 11"/>
@@ -15618,7 +15601,7 @@
         </w:rPr>
         <w:lastRenderedPageBreak/>
         <w:drawing>
-          <wp:inline distT="0" distB="0" distL="0" distR="0" wp14:anchorId="1EA2111D" wp14:editId="4A773A82">
+          <wp:inline distT="0" distB="0" distL="0" distR="0" wp14:anchorId="0B64B7F0" wp14:editId="31F126B7">
             <wp:extent cx="5120640" cy="3111275"/>
             <wp:effectExtent l="0" t="0" r="0" b="0"/>
             <wp:docPr id="12" name="Picture 12"/>
@@ -15693,7 +15676,7 @@
           <w:noProof/>
         </w:rPr>
         <w:drawing>
-          <wp:inline distT="0" distB="0" distL="0" distR="0" wp14:anchorId="5B0C772D" wp14:editId="0844CD0C">
+          <wp:inline distT="0" distB="0" distL="0" distR="0" wp14:anchorId="0B66FA9F" wp14:editId="08A96BD3">
             <wp:extent cx="5120640" cy="3111275"/>
             <wp:effectExtent l="0" t="0" r="0" b="0"/>
             <wp:docPr id="13" name="Picture 13"/>
@@ -15769,7 +15752,7 @@
         </w:rPr>
         <w:lastRenderedPageBreak/>
         <w:drawing>
-          <wp:inline distT="0" distB="0" distL="0" distR="0" wp14:anchorId="527AF4B7" wp14:editId="520AE287">
+          <wp:inline distT="0" distB="0" distL="0" distR="0" wp14:anchorId="669A2AC2" wp14:editId="43673BA7">
             <wp:extent cx="5120640" cy="3111275"/>
             <wp:effectExtent l="0" t="0" r="0" b="0"/>
             <wp:docPr id="14" name="Picture 14"/>
@@ -19805,31 +19788,31 @@
       </w:rPr>
     </w:lvl>
   </w:abstractNum>
-  <w:num w:numId="1" w16cid:durableId="1475637888">
+  <w:num w:numId="1" w16cid:durableId="334115163">
     <w:abstractNumId w:val="8"/>
   </w:num>
-  <w:num w:numId="2" w16cid:durableId="1631939893">
+  <w:num w:numId="2" w16cid:durableId="622421418">
     <w:abstractNumId w:val="6"/>
   </w:num>
-  <w:num w:numId="3" w16cid:durableId="1771660793">
+  <w:num w:numId="3" w16cid:durableId="1154488155">
     <w:abstractNumId w:val="5"/>
   </w:num>
-  <w:num w:numId="4" w16cid:durableId="2112815500">
+  <w:num w:numId="4" w16cid:durableId="955454355">
     <w:abstractNumId w:val="4"/>
   </w:num>
-  <w:num w:numId="5" w16cid:durableId="2062359723">
+  <w:num w:numId="5" w16cid:durableId="306979344">
     <w:abstractNumId w:val="7"/>
   </w:num>
-  <w:num w:numId="6" w16cid:durableId="1706370189">
+  <w:num w:numId="6" w16cid:durableId="399597132">
     <w:abstractNumId w:val="3"/>
   </w:num>
-  <w:num w:numId="7" w16cid:durableId="2108572530">
+  <w:num w:numId="7" w16cid:durableId="725226413">
     <w:abstractNumId w:val="2"/>
   </w:num>
-  <w:num w:numId="8" w16cid:durableId="343092158">
+  <w:num w:numId="8" w16cid:durableId="1567373714">
     <w:abstractNumId w:val="1"/>
   </w:num>
-  <w:num w:numId="9" w16cid:durableId="240263343">
+  <w:num w:numId="9" w16cid:durableId="270433990">
     <w:abstractNumId w:val="0"/>
   </w:num>
 </w:numbering>

</xml_diff>